<commit_message>
feat(ui): modernizar interfaz web con 7 skills de diseno y estricto cumplimiento de normas ISO 9241
</commit_message>
<xml_diff>
--- a/SEMANA 1/INFORME_CALIDAD_SOFTWARE_SEMANA1.docx
+++ b/SEMANA 1/INFORME_CALIDAD_SOFTWARE_SEMANA1.docx
@@ -1148,6 +1148,389 @@
     </w:tbl>
     <w:p>
       <w:pPr>
+        <w:pStyle w:val="Heading2"/>
+      </w:pPr>
+      <w:r>
+        <w:t>4.2 Enriquecimiento Ergonómico mediante Ecosistema de Skills Modernas</w:t>
+      </w:r>
+    </w:p>
+    <w:p>
+      <w:r>
+        <w:rPr>
+          <w:rFonts w:ascii="Arial" w:hAnsi="Arial"/>
+        </w:rPr>
+        <w:t>Para elevar la usabilidad más allá de plantillas convencionales y garantizar el estricto cumplimiento de las normas ISO 9241, se integraron 7 skills de diseño y frontend moderno en la arquitectura web:</w:t>
+      </w:r>
+    </w:p>
+    <w:tbl>
+      <w:tblPr>
+        <w:tblW w:type="auto" w:w="0"/>
+        <w:jc w:val="center"/>
+        <w:tblLook w:firstColumn="1" w:firstRow="1" w:lastColumn="0" w:lastRow="0" w:noHBand="0" w:noVBand="1" w:val="04A0"/>
+      </w:tblPr>
+      <w:tblGrid>
+        <w:gridCol w:w="3120"/>
+        <w:gridCol w:w="3120"/>
+        <w:gridCol w:w="3120"/>
+      </w:tblGrid>
+      <w:tr>
+        <w:tc>
+          <w:tcPr>
+            <w:tcW w:type="dxa" w:w="3120"/>
+            <w:shd w:val="clear" w:color="auto" w:fill="1E293B"/>
+          </w:tcPr>
+          <w:p>
+            <w:r>
+              <w:rPr>
+                <w:b/>
+                <w:color w:val="FFFFFF"/>
+              </w:rPr>
+              <w:t>Skill / Ecosistema</w:t>
+            </w:r>
+          </w:p>
+        </w:tc>
+        <w:tc>
+          <w:tcPr>
+            <w:tcW w:type="dxa" w:w="3120"/>
+            <w:shd w:val="clear" w:color="auto" w:fill="1E293B"/>
+          </w:tcPr>
+          <w:p>
+            <w:r>
+              <w:rPr>
+                <w:b/>
+                <w:color w:val="FFFFFF"/>
+              </w:rPr>
+              <w:t>Norma ISO Vinculada</w:t>
+            </w:r>
+          </w:p>
+        </w:tc>
+        <w:tc>
+          <w:tcPr>
+            <w:tcW w:type="dxa" w:w="3120"/>
+            <w:shd w:val="clear" w:color="auto" w:fill="1E293B"/>
+          </w:tcPr>
+          <w:p>
+            <w:r>
+              <w:rPr>
+                <w:b/>
+                <w:color w:val="FFFFFF"/>
+              </w:rPr>
+              <w:t>Aporte Ergonómico y Calidad</w:t>
+            </w:r>
+          </w:p>
+        </w:tc>
+      </w:tr>
+      <w:tr>
+        <w:tc>
+          <w:tcPr>
+            <w:tcW w:type="dxa" w:w="3120"/>
+          </w:tcPr>
+          <w:p>
+            <w:r>
+              <w:rPr>
+                <w:rFonts w:ascii="Arial" w:hAnsi="Arial"/>
+                <w:sz w:val="19"/>
+              </w:rPr>
+              <w:t>Design Tokens</w:t>
+            </w:r>
+          </w:p>
+        </w:tc>
+        <w:tc>
+          <w:tcPr>
+            <w:tcW w:type="dxa" w:w="3120"/>
+          </w:tcPr>
+          <w:p>
+            <w:r>
+              <w:rPr>
+                <w:rFonts w:ascii="Arial" w:hAnsi="Arial"/>
+                <w:sz w:val="19"/>
+              </w:rPr>
+              <w:t>ISO 9241-12 / 110</w:t>
+            </w:r>
+          </w:p>
+        </w:tc>
+        <w:tc>
+          <w:tcPr>
+            <w:tcW w:type="dxa" w:w="3120"/>
+          </w:tcPr>
+          <w:p>
+            <w:r>
+              <w:rPr>
+                <w:rFonts w:ascii="Arial" w:hAnsi="Arial"/>
+                <w:sz w:val="19"/>
+              </w:rPr>
+              <w:t>Rejilla matemática de 8pt, tipografía fluida con clamp() y contraste WCAG AA &gt;= 4.5:1 que elimina fatiga visual.</w:t>
+            </w:r>
+          </w:p>
+        </w:tc>
+      </w:tr>
+      <w:tr>
+        <w:tc>
+          <w:tcPr>
+            <w:tcW w:type="dxa" w:w="3120"/>
+          </w:tcPr>
+          <w:p>
+            <w:r>
+              <w:rPr>
+                <w:rFonts w:ascii="Arial" w:hAnsi="Arial"/>
+                <w:sz w:val="19"/>
+              </w:rPr>
+              <w:t>shadcn/ui</w:t>
+            </w:r>
+          </w:p>
+        </w:tc>
+        <w:tc>
+          <w:tcPr>
+            <w:tcW w:type="dxa" w:w="3120"/>
+          </w:tcPr>
+          <w:p>
+            <w:r>
+              <w:rPr>
+                <w:rFonts w:ascii="Arial" w:hAnsi="Arial"/>
+                <w:sz w:val="19"/>
+              </w:rPr>
+              <w:t>ISO 9241-11 / 110</w:t>
+            </w:r>
+          </w:p>
+        </w:tc>
+        <w:tc>
+          <w:tcPr>
+            <w:tcW w:type="dxa" w:w="3120"/>
+          </w:tcPr>
+          <w:p>
+            <w:r>
+              <w:rPr>
+                <w:rFonts w:ascii="Arial" w:hAnsi="Arial"/>
+                <w:sz w:val="19"/>
+              </w:rPr>
+              <w:t>Diseño limpio y minimalista basado en Radix UI que maximiza la eficacia en la toma de decisiones sin sobrecarga.</w:t>
+            </w:r>
+          </w:p>
+        </w:tc>
+      </w:tr>
+      <w:tr>
+        <w:tc>
+          <w:tcPr>
+            <w:tcW w:type="dxa" w:w="3120"/>
+          </w:tcPr>
+          <w:p>
+            <w:r>
+              <w:rPr>
+                <w:rFonts w:ascii="Arial" w:hAnsi="Arial"/>
+                <w:sz w:val="19"/>
+              </w:rPr>
+              <w:t>Magic UI</w:t>
+            </w:r>
+          </w:p>
+        </w:tc>
+        <w:tc>
+          <w:tcPr>
+            <w:tcW w:type="dxa" w:w="3120"/>
+          </w:tcPr>
+          <w:p>
+            <w:r>
+              <w:rPr>
+                <w:rFonts w:ascii="Arial" w:hAnsi="Arial"/>
+                <w:sz w:val="19"/>
+              </w:rPr>
+              <w:t>ISO 9241-12 / 11</w:t>
+            </w:r>
+          </w:p>
+        </w:tc>
+        <w:tc>
+          <w:tcPr>
+            <w:tcW w:type="dxa" w:w="3120"/>
+          </w:tcPr>
+          <w:p>
+            <w:r>
+              <w:rPr>
+                <w:rFonts w:ascii="Arial" w:hAnsi="Arial"/>
+                <w:sz w:val="19"/>
+              </w:rPr>
+              <w:t>Border Beam luminoso para resaltar alertas críticas, Marquee Ticker continuo y Bento Grid para estructurar datos territoriales.</w:t>
+            </w:r>
+          </w:p>
+        </w:tc>
+      </w:tr>
+      <w:tr>
+        <w:tc>
+          <w:tcPr>
+            <w:tcW w:type="dxa" w:w="3120"/>
+          </w:tcPr>
+          <w:p>
+            <w:r>
+              <w:rPr>
+                <w:rFonts w:ascii="Arial" w:hAnsi="Arial"/>
+                <w:sz w:val="19"/>
+              </w:rPr>
+              <w:t>Aceternity UI</w:t>
+            </w:r>
+          </w:p>
+        </w:tc>
+        <w:tc>
+          <w:tcPr>
+            <w:tcW w:type="dxa" w:w="3120"/>
+          </w:tcPr>
+          <w:p>
+            <w:r>
+              <w:rPr>
+                <w:rFonts w:ascii="Arial" w:hAnsi="Arial"/>
+                <w:sz w:val="19"/>
+              </w:rPr>
+              <w:t>ISO 9241-11 / 110</w:t>
+            </w:r>
+          </w:p>
+        </w:tc>
+        <w:tc>
+          <w:tcPr>
+            <w:tcW w:type="dxa" w:w="3120"/>
+          </w:tcPr>
+          <w:p>
+            <w:r>
+              <w:rPr>
+                <w:rFonts w:ascii="Arial" w:hAnsi="Arial"/>
+                <w:sz w:val="19"/>
+              </w:rPr>
+              <w:t>Fondo Aurora suave en el hero y perspectiva 3D interactiva en tarjetas de KPIs que confirma la interactividad (affordance).</w:t>
+            </w:r>
+          </w:p>
+        </w:tc>
+      </w:tr>
+      <w:tr>
+        <w:tc>
+          <w:tcPr>
+            <w:tcW w:type="dxa" w:w="3120"/>
+          </w:tcPr>
+          <w:p>
+            <w:r>
+              <w:rPr>
+                <w:rFonts w:ascii="Arial" w:hAnsi="Arial"/>
+                <w:sz w:val="19"/>
+              </w:rPr>
+              <w:t>Vaul</w:t>
+            </w:r>
+          </w:p>
+        </w:tc>
+        <w:tc>
+          <w:tcPr>
+            <w:tcW w:type="dxa" w:w="3120"/>
+          </w:tcPr>
+          <w:p>
+            <w:r>
+              <w:rPr>
+                <w:rFonts w:ascii="Arial" w:hAnsi="Arial"/>
+                <w:sz w:val="19"/>
+              </w:rPr>
+              <w:t>ISO 9241-210 / 110</w:t>
+            </w:r>
+          </w:p>
+        </w:tc>
+        <w:tc>
+          <w:tcPr>
+            <w:tcW w:type="dxa" w:w="3120"/>
+          </w:tcPr>
+          <w:p>
+            <w:r>
+              <w:rPr>
+                <w:rFonts w:ascii="Arial" w:hAnsi="Arial"/>
+                <w:sz w:val="19"/>
+              </w:rPr>
+              <w:t>Bottom sheet táctil deslizable (iOS Drawer) para consultar fórmulas y glosario epidemiológico sin abandonar el análisis.</w:t>
+            </w:r>
+          </w:p>
+        </w:tc>
+      </w:tr>
+      <w:tr>
+        <w:tc>
+          <w:tcPr>
+            <w:tcW w:type="dxa" w:w="3120"/>
+          </w:tcPr>
+          <w:p>
+            <w:r>
+              <w:rPr>
+                <w:rFonts w:ascii="Arial" w:hAnsi="Arial"/>
+                <w:sz w:val="19"/>
+              </w:rPr>
+              <w:t>Lenis</w:t>
+            </w:r>
+          </w:p>
+        </w:tc>
+        <w:tc>
+          <w:tcPr>
+            <w:tcW w:type="dxa" w:w="3120"/>
+          </w:tcPr>
+          <w:p>
+            <w:r>
+              <w:rPr>
+                <w:rFonts w:ascii="Arial" w:hAnsi="Arial"/>
+                <w:sz w:val="19"/>
+              </w:rPr>
+              <w:t>ISO 9241-11 / 12</w:t>
+            </w:r>
+          </w:p>
+        </w:tc>
+        <w:tc>
+          <w:tcPr>
+            <w:tcW w:type="dxa" w:w="3120"/>
+          </w:tcPr>
+          <w:p>
+            <w:r>
+              <w:rPr>
+                <w:rFonts w:ascii="Arial" w:hAnsi="Arial"/>
+                <w:sz w:val="19"/>
+              </w:rPr>
+              <w:t>Desplazamiento inercial suave que reduce tirones visuales y respeta el estándar de accesibilidad prefers-reduced-motion.</w:t>
+            </w:r>
+          </w:p>
+        </w:tc>
+      </w:tr>
+      <w:tr>
+        <w:tc>
+          <w:tcPr>
+            <w:tcW w:type="dxa" w:w="3120"/>
+          </w:tcPr>
+          <w:p>
+            <w:r>
+              <w:rPr>
+                <w:rFonts w:ascii="Arial" w:hAnsi="Arial"/>
+                <w:sz w:val="19"/>
+              </w:rPr>
+              <w:t>Motion Primitives</w:t>
+            </w:r>
+          </w:p>
+        </w:tc>
+        <w:tc>
+          <w:tcPr>
+            <w:tcW w:type="dxa" w:w="3120"/>
+          </w:tcPr>
+          <w:p>
+            <w:r>
+              <w:rPr>
+                <w:rFonts w:ascii="Arial" w:hAnsi="Arial"/>
+                <w:sz w:val="19"/>
+              </w:rPr>
+              <w:t>ISO 9241-110 / 11</w:t>
+            </w:r>
+          </w:p>
+        </w:tc>
+        <w:tc>
+          <w:tcPr>
+            <w:tcW w:type="dxa" w:w="3120"/>
+          </w:tcPr>
+          <w:p>
+            <w:r>
+              <w:rPr>
+                <w:rFonts w:ascii="Arial" w:hAnsi="Arial"/>
+                <w:sz w:val="19"/>
+              </w:rPr>
+              <w:t>Contadores numéricos elásticos (Number Tickers) que proporcionan retroalimentación inmediata del estado de cálculo dinámico.</w:t>
+            </w:r>
+          </w:p>
+        </w:tc>
+      </w:tr>
+    </w:tbl>
+    <w:p>
+      <w:pPr>
         <w:pStyle w:val="Heading1"/>
       </w:pPr>
       <w:r>

</xml_diff>